<commit_message>
docs(tcc): diagrama de sequência volta à página retrato (deitado, ficava menor)
Co-Authored-By: Claude Opus 5.5 (1M context) <noreply@anthropic.com>
</commit_message>
<xml_diff>
--- a/docs/tcc/artigo/Artigo_PEI_Vivo_v3.docx
+++ b/docs/tcc/artigo/Artigo_PEI_Vivo_v3.docx
@@ -7250,14 +7250,9 @@
       </w:r>
     </w:p>
     <w:p>
-      <w:pPr>
-        <w:sectPr>
-          <w:pgSz w:w="11906" w:h="16838"/>
-          <w:pgMar w:top="1701" w:right="1134" w:bottom="1134" w:left="1701" w:header="720" w:footer="720" w:gutter="0"/>
-          <w:cols w:space="720"/>
-          <w:docGrid w:linePitch="360"/>
-        </w:sectPr>
-      </w:pPr>
+      <w:r>
+        <w:br w:type="page"/>
+      </w:r>
     </w:p>
     <w:p>
       <w:pPr>
@@ -7284,7 +7279,7 @@
       <w:r>
         <w:drawing>
           <wp:inline xmlns:a="http://schemas.openxmlformats.org/drawingml/2006/main" xmlns:pic="http://schemas.openxmlformats.org/drawingml/2006/picture">
-            <wp:extent cx="4810084" cy="4860000"/>
+            <wp:extent cx="5760000" cy="5819774"/>
             <wp:docPr id="9" name="Picture 9"/>
             <wp:cNvGraphicFramePr>
               <a:graphicFrameLocks noChangeAspect="1"/>
@@ -7311,7 +7306,7 @@
                   <pic:spPr>
                     <a:xfrm>
                       <a:off x="0" y="0"/>
-                      <a:ext cx="4810084" cy="4860000"/>
+                      <a:ext cx="5760000" cy="5819774"/>
                     </a:xfrm>
                     <a:prstGeom prst="rect"/>
                   </pic:spPr>
@@ -7336,16 +7331,6 @@
         </w:rPr>
         <w:t>Fonte: Autoria própria (2026).</w:t>
       </w:r>
-    </w:p>
-    <w:p>
-      <w:pPr>
-        <w:sectPr>
-          <w:pgSz w:w="16838" w:h="11906" w:orient="landscape"/>
-          <w:pgMar w:top="1701" w:right="1134" w:bottom="1134" w:left="1701" w:header="720" w:footer="720" w:gutter="0"/>
-          <w:cols w:space="720"/>
-          <w:docGrid w:linePitch="360"/>
-        </w:sectPr>
-      </w:pPr>
     </w:p>
     <w:p>
       <w:pPr>

</xml_diff>